<commit_message>
added solution for assignment
</commit_message>
<xml_diff>
--- a/admin/Game/CluesWithAnswer.docx
+++ b/admin/Game/CluesWithAnswer.docx
@@ -471,10 +471,10 @@
           <w:bCs/>
         </w:rPr>
         <w:drawing>
-          <wp:inline distT="0" distB="0" distL="0" distR="0" wp14:anchorId="699F7484" wp14:editId="441050D9">
-            <wp:extent cx="5731510" cy="3376930"/>
+          <wp:inline distT="0" distB="0" distL="0" distR="0" wp14:anchorId="092B8AE6" wp14:editId="2FFA38B6">
+            <wp:extent cx="5731510" cy="3683635"/>
             <wp:effectExtent l="0" t="0" r="2540" b="0"/>
-            <wp:docPr id="102679846" name="Picture 1"/>
+            <wp:docPr id="642060329" name="Picture 1"/>
             <wp:cNvGraphicFramePr>
               <a:graphicFrameLocks xmlns:a="http://schemas.openxmlformats.org/drawingml/2006/main" noChangeAspect="1"/>
             </wp:cNvGraphicFramePr>
@@ -482,7 +482,7 @@
               <a:graphicData uri="http://schemas.openxmlformats.org/drawingml/2006/picture">
                 <pic:pic xmlns:pic="http://schemas.openxmlformats.org/drawingml/2006/picture">
                   <pic:nvPicPr>
-                    <pic:cNvPr id="102679846" name=""/>
+                    <pic:cNvPr id="642060329" name=""/>
                     <pic:cNvPicPr/>
                   </pic:nvPicPr>
                   <pic:blipFill>
@@ -494,7 +494,7 @@
                   <pic:spPr>
                     <a:xfrm>
                       <a:off x="0" y="0"/>
-                      <a:ext cx="5731510" cy="3376930"/>
+                      <a:ext cx="5731510" cy="3683635"/>
                     </a:xfrm>
                     <a:prstGeom prst="rect">
                       <a:avLst/>
@@ -520,8 +520,6 @@
       </w:pPr>
       <w:r>
         <w:tab/>
-      </w:r>
-      <w:r>
         <w:t>buffer</w:t>
       </w:r>
     </w:p>
@@ -613,22 +611,13 @@
           <w:bCs/>
         </w:rPr>
       </w:pPr>
-      <w:proofErr w:type="spellStart"/>
-      <w:r>
-        <w:rPr>
-          <w:b/>
-          <w:bCs/>
-        </w:rPr>
-        <w:t>I</w:t>
-      </w:r>
-      <w:r>
-        <w:rPr>
-          <w:b/>
-          <w:bCs/>
-        </w:rPr>
-        <w:t>bmmly</w:t>
-      </w:r>
-      <w:proofErr w:type="spellEnd"/>
+      <w:r>
+        <w:rPr>
+          <w:b/>
+          <w:bCs/>
+        </w:rPr>
+        <w:t>Ibmmly</w:t>
+      </w:r>
     </w:p>
     <w:p>
       <w:pPr>
@@ -790,11 +779,9 @@
             <w:pPr>
               <w:ind w:left="360"/>
             </w:pPr>
-            <w:proofErr w:type="spellStart"/>
             <w:r>
               <w:t>i</w:t>
             </w:r>
-            <w:proofErr w:type="spellEnd"/>
           </w:p>
         </w:tc>
         <w:tc>
@@ -922,15 +909,7 @@
               <w:ind w:left="360"/>
             </w:pPr>
             <w:r>
-              <w:t xml:space="preserve">l k j </w:t>
-            </w:r>
-            <w:proofErr w:type="spellStart"/>
-            <w:r>
-              <w:t>i</w:t>
-            </w:r>
-            <w:proofErr w:type="spellEnd"/>
-            <w:r>
-              <w:t xml:space="preserve"> h g </w:t>
+              <w:t xml:space="preserve">l k j i h g </w:t>
             </w:r>
             <w:r>
               <w:rPr>
@@ -987,15 +966,7 @@
               <w:ind w:left="360"/>
             </w:pPr>
             <w:r>
-              <w:t xml:space="preserve">l k j </w:t>
-            </w:r>
-            <w:proofErr w:type="spellStart"/>
-            <w:r>
-              <w:t>i</w:t>
-            </w:r>
-            <w:proofErr w:type="spellEnd"/>
-            <w:r>
-              <w:t xml:space="preserve"> h g </w:t>
+              <w:t xml:space="preserve">l k j i h g </w:t>
             </w:r>
             <w:r>
               <w:rPr>
@@ -1052,15 +1023,7 @@
               <w:ind w:left="360"/>
             </w:pPr>
             <w:r>
-              <w:t xml:space="preserve">k j </w:t>
-            </w:r>
-            <w:proofErr w:type="spellStart"/>
-            <w:r>
-              <w:t>i</w:t>
-            </w:r>
-            <w:proofErr w:type="spellEnd"/>
-            <w:r>
-              <w:t xml:space="preserve"> h g f </w:t>
+              <w:t xml:space="preserve">k j i h g f </w:t>
             </w:r>
             <w:r>
               <w:rPr>
@@ -1219,15 +1182,7 @@
       </w:r>
       <w:r>
         <w:br/>
-        <w:t>I may end in .java, .txt, or .</w:t>
-      </w:r>
-      <w:proofErr w:type="spellStart"/>
-      <w:r>
-        <w:t>png</w:t>
-      </w:r>
-      <w:proofErr w:type="spellEnd"/>
-      <w:r>
-        <w:t>.</w:t>
+        <w:t>I may end in .java, .txt, or .png.</w:t>
       </w:r>
       <w:r>
         <w:br/>
@@ -2389,6 +2344,7 @@
   <w:style w:type="character" w:default="1" w:styleId="DefaultParagraphFont">
     <w:name w:val="Default Paragraph Font"/>
     <w:uiPriority w:val="1"/>
+    <w:semiHidden/>
     <w:unhideWhenUsed/>
   </w:style>
   <w:style w:type="table" w:default="1" w:styleId="TableNormal">

</xml_diff>